<commit_message>
Correct Catalyst agreement contact info
</commit_message>
<xml_diff>
--- a/generated-agreements/Catalyst_Coaching_Agreement_Branded_Template.docx
+++ b/generated-agreements/Catalyst_Coaching_Agreement_Branded_Template.docx
@@ -1421,7 +1421,7 @@
           <w:sz w:val="14"/>
           <w:szCs w:val="14"/>
         </w:rPr>
-        <w:t xml:space="preserve">catalyst.coachingelite.com</w:t>
+        <w:t xml:space="preserve">www.catalystcoachingelite.com</w:t>
       </w:r>
       <w:r>
         <w:rPr>
@@ -1430,7 +1430,7 @@
           <w:sz w:val="13"/>
           <w:szCs w:val="13"/>
         </w:rPr>
-        <w:t xml:space="preserve">   |   coaching.headcoach@gmail.com   |   @catalyst.coaching.llc</w:t>
+        <w:t xml:space="preserve">   |   catalyst.coaching.headcoach@gmail.com   |   @catalystcoachingelite</w:t>
       </w:r>
     </w:p>
     <w:sectPr>

</xml_diff>